<commit_message>
fix: Correcao de parsing do docxtpl removendo tags w:tr invalidas no modelo base
</commit_message>
<xml_diff>
--- a/infraestrutura/relatorios/modelos/modelo_relatorio.docx
+++ b/infraestrutura/relatorios/modelos/modelo_relatorio.docx
@@ -134,7 +134,7 @@
           </w:tcPr>
           <w:p>
             <w:r>
-              <w:t>{% tr for row in DADOS_CADASTRAIS_LIST %}{{row.proprietario}}</w:t>
+              <w:t>{% for row in DADOS_CADASTRAIS_LIST %}{{row.proprietario}}</w:t>
             </w:r>
           </w:p>
         </w:tc>
@@ -174,7 +174,7 @@
           </w:tcPr>
           <w:p>
             <w:r>
-              <w:t>{{row.area}}{% tr endfor %}</w:t>
+              <w:t>{{row.area}}{% endfor %}</w:t>
             </w:r>
           </w:p>
         </w:tc>
@@ -234,7 +234,7 @@
           </w:tcPr>
           <w:p>
             <w:r>
-              <w:t>{% tr for row in TABELA_TESTADAS_LIST %}{{row.limite}}</w:t>
+              <w:t>{% for row in TABELA_TESTADAS_LIST %}{{row.limite}}</w:t>
             </w:r>
           </w:p>
         </w:tc>
@@ -244,7 +244,7 @@
           </w:tcPr>
           <w:p>
             <w:r>
-              <w:t>{{row.comprimento}}{% tr endfor %}</w:t>
+              <w:t>{{row.comprimento}}{% endfor %}</w:t>
             </w:r>
           </w:p>
         </w:tc>
@@ -532,7 +532,7 @@
           </w:tcPr>
           <w:p>
             <w:r>
-              <w:t>{% tr for row in TABELA_INCLINACAO_LIST %}{{row.faixa}}</w:t>
+              <w:t>{% for row in TABELA_INCLINACAO_LIST %}{{row.faixa}}</w:t>
             </w:r>
           </w:p>
         </w:tc>
@@ -562,7 +562,7 @@
           </w:tcPr>
           <w:p>
             <w:r>
-              <w:t>{{row.notas}}{% tr endfor %}</w:t>
+              <w:t>{{row.notas}}{% endfor %}</w:t>
             </w:r>
           </w:p>
         </w:tc>

</xml_diff>

<commit_message>
feat: Redesign visual do DOCX com tabelas sem borda para legendas de cor (inclinacao e risco), multizonas dinamicas, notas em bullet points e popup de alerta de lote nao selecionado
</commit_message>
<xml_diff>
--- a/infraestrutura/relatorios/modelos/modelo_relatorio.docx
+++ b/infraestrutura/relatorios/modelos/modelo_relatorio.docx
@@ -266,27 +266,145 @@
         <w:tblLook w:firstColumn="1" w:firstRow="1" w:lastColumn="0" w:lastRow="0" w:noHBand="0" w:noVBand="1" w:val="04A0"/>
       </w:tblPr>
       <w:tblGrid>
-        <w:gridCol w:w="4393"/>
-        <w:gridCol w:w="4393"/>
+        <w:gridCol w:w="879"/>
+        <w:gridCol w:w="879"/>
+        <w:gridCol w:w="879"/>
+        <w:gridCol w:w="879"/>
+        <w:gridCol w:w="879"/>
+        <w:gridCol w:w="879"/>
+        <w:gridCol w:w="879"/>
+        <w:gridCol w:w="879"/>
+        <w:gridCol w:w="879"/>
+        <w:gridCol w:w="879"/>
       </w:tblGrid>
       <w:tr>
         <w:tc>
           <w:tcPr>
-            <w:tcW w:type="dxa" w:w="4393"/>
+            <w:tcW w:type="dxa" w:w="879"/>
           </w:tcPr>
           <w:p>
             <w:r>
-              <w:t>C.A. Máximo</w:t>
+              <w:rPr>
+                <w:b/>
+              </w:rPr>
+              <w:t>Zona</w:t>
             </w:r>
           </w:p>
         </w:tc>
         <w:tc>
           <w:tcPr>
-            <w:tcW w:type="dxa" w:w="4393"/>
+            <w:tcW w:type="dxa" w:w="879"/>
           </w:tcPr>
           <w:p>
             <w:r>
-              <w:t>{{ CA_MAX_AJ }}</w:t>
+              <w:rPr>
+                <w:b/>
+              </w:rPr>
+              <w:t>Área</w:t>
+            </w:r>
+          </w:p>
+        </w:tc>
+        <w:tc>
+          <w:tcPr>
+            <w:tcW w:type="dxa" w:w="879"/>
+          </w:tcPr>
+          <w:p>
+            <w:r>
+              <w:rPr>
+                <w:b/>
+              </w:rPr>
+              <w:t>%</w:t>
+            </w:r>
+          </w:p>
+        </w:tc>
+        <w:tc>
+          <w:tcPr>
+            <w:tcW w:type="dxa" w:w="879"/>
+          </w:tcPr>
+          <w:p>
+            <w:r>
+              <w:rPr>
+                <w:b/>
+              </w:rPr>
+              <w:t>C.A max</w:t>
+            </w:r>
+          </w:p>
+        </w:tc>
+        <w:tc>
+          <w:tcPr>
+            <w:tcW w:type="dxa" w:w="879"/>
+          </w:tcPr>
+          <w:p>
+            <w:r>
+              <w:rPr>
+                <w:b/>
+              </w:rPr>
+              <w:t>C.A bas</w:t>
+            </w:r>
+          </w:p>
+        </w:tc>
+        <w:tc>
+          <w:tcPr>
+            <w:tcW w:type="dxa" w:w="879"/>
+          </w:tcPr>
+          <w:p>
+            <w:r>
+              <w:rPr>
+                <w:b/>
+              </w:rPr>
+              <w:t>TPS (Perm)</w:t>
+            </w:r>
+          </w:p>
+        </w:tc>
+        <w:tc>
+          <w:tcPr>
+            <w:tcW w:type="dxa" w:w="879"/>
+          </w:tcPr>
+          <w:p>
+            <w:r>
+              <w:rPr>
+                <w:b/>
+              </w:rPr>
+              <w:t>TOS (Ocup)</w:t>
+            </w:r>
+          </w:p>
+        </w:tc>
+        <w:tc>
+          <w:tcPr>
+            <w:tcW w:type="dxa" w:w="879"/>
+          </w:tcPr>
+          <w:p>
+            <w:r>
+              <w:rPr>
+                <w:b/>
+              </w:rPr>
+              <w:t>Pav Bas</w:t>
+            </w:r>
+          </w:p>
+        </w:tc>
+        <w:tc>
+          <w:tcPr>
+            <w:tcW w:type="dxa" w:w="879"/>
+          </w:tcPr>
+          <w:p>
+            <w:r>
+              <w:rPr>
+                <w:b/>
+              </w:rPr>
+              <w:t>Pav Max</w:t>
+            </w:r>
+          </w:p>
+        </w:tc>
+        <w:tc>
+          <w:tcPr>
+            <w:tcW w:type="dxa" w:w="879"/>
+          </w:tcPr>
+          <w:p>
+            <w:r>
+              <w:rPr>
+                <w:b/>
+              </w:rPr>
+              <w:t>Recuo Fr</w:t>
             </w:r>
           </w:p>
         </w:tc>
@@ -294,109 +412,101 @@
       <w:tr>
         <w:tc>
           <w:tcPr>
-            <w:tcW w:type="dxa" w:w="4393"/>
+            <w:tcW w:type="dxa" w:w="879"/>
           </w:tcPr>
           <w:p>
             <w:r>
-              <w:t>C.A. Básico</w:t>
+              <w:t>{% for row in TABELA_ZONAS_LIST %}{{row.codigo}}</w:t>
             </w:r>
           </w:p>
         </w:tc>
         <w:tc>
           <w:tcPr>
-            <w:tcW w:type="dxa" w:w="4393"/>
+            <w:tcW w:type="dxa" w:w="879"/>
           </w:tcPr>
           <w:p>
             <w:r>
-              <w:t>{{ CA_BAS }}</w:t>
-            </w:r>
-          </w:p>
-        </w:tc>
-      </w:tr>
-      <w:tr>
-        <w:tc>
-          <w:tcPr>
-            <w:tcW w:type="dxa" w:w="4393"/>
-          </w:tcPr>
-          <w:p>
-            <w:r>
-              <w:t>Taxa Permeabilidade (TPS)</w:t>
+              <w:t>{{row.area}}</w:t>
             </w:r>
           </w:p>
         </w:tc>
         <w:tc>
           <w:tcPr>
-            <w:tcW w:type="dxa" w:w="4393"/>
+            <w:tcW w:type="dxa" w:w="879"/>
           </w:tcPr>
           <w:p>
             <w:r>
-              <w:t>{{ TPS }}</w:t>
-            </w:r>
-          </w:p>
-        </w:tc>
-      </w:tr>
-      <w:tr>
-        <w:tc>
-          <w:tcPr>
-            <w:tcW w:type="dxa" w:w="4393"/>
-          </w:tcPr>
-          <w:p>
-            <w:r>
-              <w:t>Taxa de Ocupação (TOS)</w:t>
+              <w:t>{{row.perc}}</w:t>
             </w:r>
           </w:p>
         </w:tc>
         <w:tc>
           <w:tcPr>
-            <w:tcW w:type="dxa" w:w="4393"/>
+            <w:tcW w:type="dxa" w:w="879"/>
           </w:tcPr>
           <w:p>
             <w:r>
-              <w:t>{{ TOS }}</w:t>
-            </w:r>
-          </w:p>
-        </w:tc>
-      </w:tr>
-      <w:tr>
-        <w:tc>
-          <w:tcPr>
-            <w:tcW w:type="dxa" w:w="4393"/>
-          </w:tcPr>
-          <w:p>
-            <w:r>
-              <w:t>Recuo Frontal</w:t>
+              <w:t>{{row.ca_max}}</w:t>
             </w:r>
           </w:p>
         </w:tc>
         <w:tc>
           <w:tcPr>
-            <w:tcW w:type="dxa" w:w="4393"/>
+            <w:tcW w:type="dxa" w:w="879"/>
           </w:tcPr>
           <w:p>
             <w:r>
-              <w:t>{{ RF }}</w:t>
-            </w:r>
-          </w:p>
-        </w:tc>
-      </w:tr>
-      <w:tr>
-        <w:tc>
-          <w:tcPr>
-            <w:tcW w:type="dxa" w:w="4393"/>
-          </w:tcPr>
-          <w:p>
-            <w:r>
-              <w:t>Nº de Pavimentos</w:t>
+              <w:t>{{row.ca_bas}}</w:t>
             </w:r>
           </w:p>
         </w:tc>
         <w:tc>
           <w:tcPr>
-            <w:tcW w:type="dxa" w:w="4393"/>
+            <w:tcW w:type="dxa" w:w="879"/>
           </w:tcPr>
           <w:p>
             <w:r>
-              <w:t>{{ NP_BAS }}</w:t>
+              <w:t>{{row.tps}}</w:t>
+            </w:r>
+          </w:p>
+        </w:tc>
+        <w:tc>
+          <w:tcPr>
+            <w:tcW w:type="dxa" w:w="879"/>
+          </w:tcPr>
+          <w:p>
+            <w:r>
+              <w:t>{{row.tos}}</w:t>
+            </w:r>
+          </w:p>
+        </w:tc>
+        <w:tc>
+          <w:tcPr>
+            <w:tcW w:type="dxa" w:w="879"/>
+          </w:tcPr>
+          <w:p>
+            <w:r>
+              <w:t>{{row.np_bas}}</w:t>
+            </w:r>
+          </w:p>
+        </w:tc>
+        <w:tc>
+          <w:tcPr>
+            <w:tcW w:type="dxa" w:w="879"/>
+          </w:tcPr>
+          <w:p>
+            <w:r>
+              <w:t>{{row.np_max}}</w:t>
+            </w:r>
+          </w:p>
+        </w:tc>
+        <w:tc>
+          <w:tcPr>
+            <w:tcW w:type="dxa" w:w="879"/>
+          </w:tcPr>
+          <w:p>
+            <w:r>
+              <w:t>{{row.rf}}{% endfor %}</w:t>
             </w:r>
           </w:p>
         </w:tc>
@@ -413,7 +523,7 @@
     </w:p>
     <w:p>
       <w:r>
-        <w:t>Faixa NUIC: {{ APP_FAIXA_STATUS }} ({{ APP_FAIXA_LARGURA }}) - {{ APP_FAIXA_OBS }}</w:t>
+        <w:t>Faixa NUIC: {{ APP_FAIXA_STATUS }} ({{ APP_FAIXA_LARGURA }} m) - {{ APP_FAIXA_OBS }}</w:t>
       </w:r>
     </w:p>
     <w:p>
@@ -430,38 +540,8 @@
         <w:t>5. RISCOS GEOAMBIENTAIS</w:t>
       </w:r>
     </w:p>
-    <w:p>
-      <w:r>
-        <w:t>Risco de Inundação: {{ RISCO_INUND_CLASSE }} - Grau: {{ RISCO_INUND_GRAU }}</w:t>
-      </w:r>
-    </w:p>
-    <w:p>
-      <w:r>
-        <w:t>Recomendação: {{ RISCO_INUND_RECOM }}</w:t>
-      </w:r>
-    </w:p>
-    <w:p>
-      <w:r>
-        <w:t>Risco Movimento Massa: {{ RISCO_MOV_CLASSE }} - Grau: {{ RISCO_MOV_GRAU }}</w:t>
-      </w:r>
-    </w:p>
-    <w:p>
-      <w:r>
-        <w:t>Recomendação: {{ RISCO_MOV_RECOM }}</w:t>
-      </w:r>
-    </w:p>
-    <w:p/>
-    <w:p>
-      <w:pPr>
-        <w:pStyle w:val="ZoniHeading"/>
-      </w:pPr>
-      <w:r>
-        <w:t>6. INCLINAÇÃO DO TERRENO</w:t>
-      </w:r>
-    </w:p>
     <w:tbl>
       <w:tblPr>
-        <w:tblStyle w:val="Tabelacomgrade"/>
         <w:tblW w:type="auto" w:w="0"/>
         <w:tblLook w:firstColumn="1" w:firstRow="1" w:lastColumn="0" w:lastRow="0" w:noHBand="0" w:noVBand="1" w:val="04A0"/>
       </w:tblPr>
@@ -474,7 +554,125 @@
       <w:tr>
         <w:tc>
           <w:tcPr>
+            <w:tcW w:type="dxa" w:w="4394"/>
+            <w:gridSpan w:val="2"/>
+          </w:tcPr>
+          <w:p>
+            <w:r>
+              <w:rPr>
+                <w:b/>
+              </w:rPr>
+              <w:t>Suscetibilidade a Inundação</w:t>
+            </w:r>
+          </w:p>
+        </w:tc>
+        <w:tc>
+          <w:tcPr>
+            <w:tcW w:type="dxa" w:w="4394"/>
+            <w:gridSpan w:val="2"/>
+          </w:tcPr>
+          <w:p>
+            <w:r>
+              <w:rPr>
+                <w:b/>
+              </w:rPr>
+              <w:t>Suscetibilidade a Movimentos de Massa</w:t>
+            </w:r>
+          </w:p>
+        </w:tc>
+      </w:tr>
+      <w:tr>
+        <w:tc>
+          <w:tcPr>
             <w:tcW w:type="dxa" w:w="2197"/>
+          </w:tcPr>
+          <w:p>
+            <w:r>
+              <w:t xml:space="preserve">{% cellbg RISCO_INUND_COR %} </w:t>
+            </w:r>
+          </w:p>
+        </w:tc>
+        <w:tc>
+          <w:tcPr>
+            <w:tcW w:type="dxa" w:w="2197"/>
+          </w:tcPr>
+          <w:p>
+            <w:r>
+              <w:t>{{ RISCO_INUND_GRAU }}</w:t>
+            </w:r>
+          </w:p>
+        </w:tc>
+        <w:tc>
+          <w:tcPr>
+            <w:tcW w:type="dxa" w:w="2197"/>
+          </w:tcPr>
+          <w:p>
+            <w:r>
+              <w:t xml:space="preserve">{% cellbg RISCO_MOV_COR %} </w:t>
+            </w:r>
+          </w:p>
+        </w:tc>
+        <w:tc>
+          <w:tcPr>
+            <w:tcW w:type="dxa" w:w="2197"/>
+          </w:tcPr>
+          <w:p>
+            <w:r>
+              <w:t>{{ RISCO_MOV_GRAU }}</w:t>
+            </w:r>
+          </w:p>
+        </w:tc>
+      </w:tr>
+      <w:tr>
+        <w:tc>
+          <w:tcPr>
+            <w:tcW w:type="dxa" w:w="4394"/>
+            <w:gridSpan w:val="2"/>
+          </w:tcPr>
+          <w:p>
+            <w:r>
+              <w:t>{{ RISCO_INUND_RECOM }}</w:t>
+            </w:r>
+          </w:p>
+        </w:tc>
+        <w:tc>
+          <w:tcPr>
+            <w:tcW w:type="dxa" w:w="4394"/>
+            <w:gridSpan w:val="2"/>
+          </w:tcPr>
+          <w:p>
+            <w:r>
+              <w:t>{{ RISCO_MOV_RECOM }}</w:t>
+            </w:r>
+          </w:p>
+        </w:tc>
+      </w:tr>
+    </w:tbl>
+    <w:p/>
+    <w:p>
+      <w:pPr>
+        <w:pStyle w:val="ZoniHeading"/>
+      </w:pPr>
+      <w:r>
+        <w:t>6. INCLINAÇÃO DO TERRENO</w:t>
+      </w:r>
+    </w:p>
+    <w:tbl>
+      <w:tblPr>
+        <w:tblW w:type="auto" w:w="0"/>
+        <w:tblLook w:firstColumn="1" w:firstRow="1" w:lastColumn="0" w:lastRow="0" w:noHBand="0" w:noVBand="1" w:val="04A0"/>
+      </w:tblPr>
+      <w:tblGrid>
+        <w:gridCol w:w="1757"/>
+        <w:gridCol w:w="1757"/>
+        <w:gridCol w:w="1757"/>
+        <w:gridCol w:w="1757"/>
+        <w:gridCol w:w="1757"/>
+      </w:tblGrid>
+      <w:tr>
+        <w:tc>
+          <w:tcPr>
+            <w:tcW w:type="dxa" w:w="1757"/>
           </w:tcPr>
           <w:p>
             <w:r>
@@ -487,7 +685,20 @@
         </w:tc>
         <w:tc>
           <w:tcPr>
-            <w:tcW w:type="dxa" w:w="2197"/>
+            <w:tcW w:type="dxa" w:w="1757"/>
+          </w:tcPr>
+          <w:p>
+            <w:r>
+              <w:rPr>
+                <w:b/>
+              </w:rPr>
+              <w:t>Legenda</w:t>
+            </w:r>
+          </w:p>
+        </w:tc>
+        <w:tc>
+          <w:tcPr>
+            <w:tcW w:type="dxa" w:w="1757"/>
           </w:tcPr>
           <w:p>
             <w:r>
@@ -500,7 +711,7 @@
         </w:tc>
         <w:tc>
           <w:tcPr>
-            <w:tcW w:type="dxa" w:w="2197"/>
+            <w:tcW w:type="dxa" w:w="1757"/>
           </w:tcPr>
           <w:p>
             <w:r>
@@ -513,7 +724,7 @@
         </w:tc>
         <w:tc>
           <w:tcPr>
-            <w:tcW w:type="dxa" w:w="2197"/>
+            <w:tcW w:type="dxa" w:w="1757"/>
           </w:tcPr>
           <w:p>
             <w:r>
@@ -528,7 +739,7 @@
       <w:tr>
         <w:tc>
           <w:tcPr>
-            <w:tcW w:type="dxa" w:w="2197"/>
+            <w:tcW w:type="dxa" w:w="1757"/>
           </w:tcPr>
           <w:p>
             <w:r>
@@ -538,7 +749,17 @@
         </w:tc>
         <w:tc>
           <w:tcPr>
-            <w:tcW w:type="dxa" w:w="2197"/>
+            <w:tcW w:type="dxa" w:w="1757"/>
+          </w:tcPr>
+          <w:p>
+            <w:r>
+              <w:t>{{{% cellbg row.cor %} }}</w:t>
+            </w:r>
+          </w:p>
+        </w:tc>
+        <w:tc>
+          <w:tcPr>
+            <w:tcW w:type="dxa" w:w="1757"/>
           </w:tcPr>
           <w:p>
             <w:r>
@@ -548,7 +769,7 @@
         </w:tc>
         <w:tc>
           <w:tcPr>
-            <w:tcW w:type="dxa" w:w="2197"/>
+            <w:tcW w:type="dxa" w:w="1757"/>
           </w:tcPr>
           <w:p>
             <w:r>
@@ -558,7 +779,7 @@
         </w:tc>
         <w:tc>
           <w:tcPr>
-            <w:tcW w:type="dxa" w:w="2197"/>
+            <w:tcW w:type="dxa" w:w="1757"/>
           </w:tcPr>
           <w:p>
             <w:r>
@@ -574,7 +795,44 @@
         <w:pStyle w:val="ZoniHeading"/>
       </w:pPr>
       <w:r>
-        <w:t>7. MAPA DE SITUAÇÃO / ANEXOS GRAFICOS</w:t>
+        <w:t>7. NOTAS E CONDICIONANTES TÉCNICAS</w:t>
+      </w:r>
+    </w:p>
+    <w:p>
+      <w:r>
+        <w:t>{% for nota in LISTA_NOTAS_ANEXO_ARRAY %}• {{ nota.texto }}</w:t>
+        <w:br/>
+        <w:t>{% endfor %}</w:t>
+      </w:r>
+    </w:p>
+    <w:p>
+      <w:r>
+        <w:t>{% for nota in LISTA_CONDICIONANTES_ARRAY %}• {{ nota.texto }}</w:t>
+        <w:br/>
+        <w:t>{% endfor %}</w:t>
+      </w:r>
+    </w:p>
+    <w:p>
+      <w:r>
+        <w:t>{% for nota in LISTA_RESTRICOES_ARRAY %}• {{ nota.texto }}</w:t>
+        <w:br/>
+        <w:t>{% endfor %}</w:t>
+      </w:r>
+    </w:p>
+    <w:p>
+      <w:r>
+        <w:t>{% for nota in LISTA_NOTAS_ARRAY %}• {{ nota.texto }}</w:t>
+        <w:br/>
+        <w:t>{% endfor %}</w:t>
+      </w:r>
+    </w:p>
+    <w:p/>
+    <w:p>
+      <w:pPr>
+        <w:pStyle w:val="ZoniHeading"/>
+      </w:pPr>
+      <w:r>
+        <w:t>8. MAPA DE SITUAÇÃO / ANEXOS GRAFICOS</w:t>
       </w:r>
     </w:p>
     <w:p>

</xml_diff>

<commit_message>
fix: Corrigir error de Jinja - cellbg nao pode ser envolvido em {{ }}, notas convertidas para strings pre-montadas com bullets
</commit_message>
<xml_diff>
--- a/infraestrutura/relatorios/modelos/modelo_relatorio.docx
+++ b/infraestrutura/relatorios/modelos/modelo_relatorio.docx
@@ -753,7 +753,7 @@
           </w:tcPr>
           <w:p>
             <w:r>
-              <w:t>{{{% cellbg row.cor %} }}</w:t>
+              <w:t xml:space="preserve">{% cellbg row.cor %} </w:t>
             </w:r>
           </w:p>
         </w:tc>
@@ -800,30 +800,17 @@
     </w:p>
     <w:p>
       <w:r>
-        <w:t>{% for nota in LISTA_NOTAS_ANEXO_ARRAY %}• {{ nota.texto }}</w:t>
-        <w:br/>
-        <w:t>{% endfor %}</w:t>
+        <w:t>{{ LISTA_NOTAS_ANEXO_BULLETS }}</w:t>
       </w:r>
     </w:p>
     <w:p>
       <w:r>
-        <w:t>{% for nota in LISTA_CONDICIONANTES_ARRAY %}• {{ nota.texto }}</w:t>
-        <w:br/>
-        <w:t>{% endfor %}</w:t>
+        <w:t>{{ LISTA_CONDICIONANTES_BULLETS }}</w:t>
       </w:r>
     </w:p>
     <w:p>
       <w:r>
-        <w:t>{% for nota in LISTA_RESTRICOES_ARRAY %}• {{ nota.texto }}</w:t>
-        <w:br/>
-        <w:t>{% endfor %}</w:t>
-      </w:r>
-    </w:p>
-    <w:p>
-      <w:r>
-        <w:t>{% for nota in LISTA_NOTAS_ARRAY %}• {{ nota.texto }}</w:t>
-        <w:br/>
-        <w:t>{% endfor %}</w:t>
+        <w:t>{{ LISTA_RESTRICOES_BULLETS }}</w:t>
       </w:r>
     </w:p>
     <w:p/>

</xml_diff>

<commit_message>
fix: Corrigir repeticao de linhas em tabela (uso de %tr for correto), larguras fixas de coluna e estilo visual aprimorado
</commit_message>
<xml_diff>
--- a/infraestrutura/relatorios/modelos/modelo_relatorio.docx
+++ b/infraestrutura/relatorios/modelos/modelo_relatorio.docx
@@ -14,7 +14,8 @@
       <w:r>
         <w:rPr>
           <w:b/>
-          <w:sz w:val="28"/>
+          <w:color w:val="1F497D"/>
+          <w:sz w:val="26"/>
           <w:u w:val="single"/>
         </w:rPr>
         <w:t>RELATÓRIO TÉCNICO DE ANÁLISE URBANÍSTICA</w:t>
@@ -27,7 +28,7 @@
       <w:r>
         <w:rPr>
           <w:b/>
-          <w:sz w:val="24"/>
+          <w:sz w:val="22"/>
         </w:rPr>
         <w:t>{{ TIPO_ANALISE }}</w:t>
       </w:r>
@@ -51,6 +52,7 @@
       <w:tblPr>
         <w:tblStyle w:val="Tabelacomgrade"/>
         <w:tblW w:type="auto" w:w="0"/>
+        <w:tblLayout w:type="fixed"/>
         <w:tblLook w:firstColumn="1" w:firstRow="1" w:lastColumn="0" w:lastRow="0" w:noHBand="0" w:noVBand="1" w:val="04A0"/>
       </w:tblPr>
       <w:tblGrid>
@@ -63,12 +65,13 @@
       <w:tr>
         <w:tc>
           <w:tcPr>
-            <w:tcW w:type="dxa" w:w="1757"/>
+            <w:tcW w:type="dxa" w:w="2835"/>
           </w:tcPr>
           <w:p>
             <w:r>
               <w:rPr>
                 <w:b/>
+                <w:sz w:val="18"/>
               </w:rPr>
               <w:t>Proprietário</w:t>
             </w:r>
@@ -76,51 +79,55 @@
         </w:tc>
         <w:tc>
           <w:tcPr>
-            <w:tcW w:type="dxa" w:w="1757"/>
+            <w:tcW w:type="dxa" w:w="1984"/>
           </w:tcPr>
           <w:p>
             <w:r>
               <w:rPr>
                 <w:b/>
+                <w:sz w:val="18"/>
               </w:rPr>
-              <w:t>Inscrição</w:t>
+              <w:t>Inscrição / Matrícula</w:t>
             </w:r>
           </w:p>
         </w:tc>
         <w:tc>
           <w:tcPr>
-            <w:tcW w:type="dxa" w:w="1757"/>
+            <w:tcW w:type="dxa" w:w="2835"/>
           </w:tcPr>
           <w:p>
             <w:r>
               <w:rPr>
                 <w:b/>
+                <w:sz w:val="18"/>
               </w:rPr>
-              <w:t>Endereço Completo</w:t>
+              <w:t>Endereço</w:t>
             </w:r>
           </w:p>
         </w:tc>
         <w:tc>
           <w:tcPr>
-            <w:tcW w:type="dxa" w:w="1757"/>
+            <w:tcW w:type="dxa" w:w="2268"/>
           </w:tcPr>
           <w:p>
             <w:r>
               <w:rPr>
                 <w:b/>
+                <w:sz w:val="18"/>
               </w:rPr>
-              <w:t>Loteamento</w:t>
+              <w:t>Loteamento / Qd / Lt</w:t>
             </w:r>
           </w:p>
         </w:tc>
         <w:tc>
           <w:tcPr>
-            <w:tcW w:type="dxa" w:w="1757"/>
+            <w:tcW w:type="dxa" w:w="1417"/>
           </w:tcPr>
           <w:p>
             <w:r>
               <w:rPr>
                 <w:b/>
+                <w:sz w:val="18"/>
               </w:rPr>
               <w:t>Área (m²)</w:t>
             </w:r>
@@ -130,51 +137,66 @@
       <w:tr>
         <w:tc>
           <w:tcPr>
-            <w:tcW w:type="dxa" w:w="1757"/>
+            <w:tcW w:type="dxa" w:w="2835"/>
           </w:tcPr>
           <w:p>
             <w:r>
-              <w:t>{% for row in DADOS_CADASTRAIS_LIST %}{{row.proprietario}}</w:t>
+              <w:rPr>
+                <w:sz w:val="18"/>
+              </w:rPr>
+              <w:t>{%tr for row in DADOS_CADASTRAIS_LIST %}{{row.proprietario}}</w:t>
             </w:r>
           </w:p>
         </w:tc>
         <w:tc>
           <w:tcPr>
-            <w:tcW w:type="dxa" w:w="1757"/>
+            <w:tcW w:type="dxa" w:w="1984"/>
           </w:tcPr>
           <w:p>
             <w:r>
+              <w:rPr>
+                <w:sz w:val="18"/>
+              </w:rPr>
               <w:t>{{row.inscricao}}</w:t>
             </w:r>
           </w:p>
         </w:tc>
         <w:tc>
           <w:tcPr>
-            <w:tcW w:type="dxa" w:w="1757"/>
+            <w:tcW w:type="dxa" w:w="2835"/>
           </w:tcPr>
           <w:p>
             <w:r>
+              <w:rPr>
+                <w:sz w:val="18"/>
+              </w:rPr>
               <w:t>{{row.endereco}}</w:t>
             </w:r>
           </w:p>
         </w:tc>
         <w:tc>
           <w:tcPr>
-            <w:tcW w:type="dxa" w:w="1757"/>
+            <w:tcW w:type="dxa" w:w="2268"/>
           </w:tcPr>
           <w:p>
             <w:r>
+              <w:rPr>
+                <w:sz w:val="18"/>
+              </w:rPr>
               <w:t>{{row.loteamento}}</w:t>
             </w:r>
           </w:p>
         </w:tc>
         <w:tc>
           <w:tcPr>
-            <w:tcW w:type="dxa" w:w="1757"/>
+            <w:tcW w:type="dxa" w:w="1417"/>
           </w:tcPr>
           <w:p>
             <w:r>
-              <w:t>{{row.area}}{% endfor %}</w:t>
+              <w:rPr>
+                <w:sz w:val="18"/>
+              </w:rPr>
+              <w:t>{{row.area}}{%tr endfor %}</w:t>
             </w:r>
           </w:p>
         </w:tc>
@@ -193,6 +215,7 @@
       <w:tblPr>
         <w:tblStyle w:val="Tabelacomgrade"/>
         <w:tblW w:type="auto" w:w="0"/>
+        <w:tblLayout w:type="fixed"/>
         <w:tblLook w:firstColumn="1" w:firstRow="1" w:lastColumn="0" w:lastRow="0" w:noHBand="0" w:noVBand="1" w:val="04A0"/>
       </w:tblPr>
       <w:tblGrid>
@@ -202,12 +225,13 @@
       <w:tr>
         <w:tc>
           <w:tcPr>
-            <w:tcW w:type="dxa" w:w="4393"/>
+            <w:tcW w:type="dxa" w:w="7370"/>
           </w:tcPr>
           <w:p>
             <w:r>
               <w:rPr>
                 <w:b/>
+                <w:sz w:val="18"/>
               </w:rPr>
               <w:t>Limite / Logradouro</w:t>
             </w:r>
@@ -215,12 +239,13 @@
         </w:tc>
         <w:tc>
           <w:tcPr>
-            <w:tcW w:type="dxa" w:w="4393"/>
+            <w:tcW w:type="dxa" w:w="2268"/>
           </w:tcPr>
           <w:p>
             <w:r>
               <w:rPr>
                 <w:b/>
+                <w:sz w:val="18"/>
               </w:rPr>
               <w:t>Comprimento (m)</w:t>
             </w:r>
@@ -230,21 +255,27 @@
       <w:tr>
         <w:tc>
           <w:tcPr>
-            <w:tcW w:type="dxa" w:w="4393"/>
+            <w:tcW w:type="dxa" w:w="7370"/>
           </w:tcPr>
           <w:p>
             <w:r>
-              <w:t>{% for row in TABELA_TESTADAS_LIST %}{{row.limite}}</w:t>
+              <w:rPr>
+                <w:sz w:val="18"/>
+              </w:rPr>
+              <w:t>{%tr for row in TABELA_TESTADAS_LIST %}{{row.limite}}</w:t>
             </w:r>
           </w:p>
         </w:tc>
         <w:tc>
           <w:tcPr>
-            <w:tcW w:type="dxa" w:w="4393"/>
+            <w:tcW w:type="dxa" w:w="2268"/>
           </w:tcPr>
           <w:p>
             <w:r>
-              <w:t>{{row.comprimento}}{% endfor %}</w:t>
+              <w:rPr>
+                <w:sz w:val="18"/>
+              </w:rPr>
+              <w:t>{{row.comprimento}}{%tr endfor %}</w:t>
             </w:r>
           </w:p>
         </w:tc>
@@ -263,6 +294,7 @@
       <w:tblPr>
         <w:tblStyle w:val="Tabelacomgrade"/>
         <w:tblW w:type="auto" w:w="0"/>
+        <w:tblLayout w:type="fixed"/>
         <w:tblLook w:firstColumn="1" w:firstRow="1" w:lastColumn="0" w:lastRow="0" w:noHBand="0" w:noVBand="1" w:val="04A0"/>
       </w:tblPr>
       <w:tblGrid>
@@ -280,12 +312,13 @@
       <w:tr>
         <w:tc>
           <w:tcPr>
-            <w:tcW w:type="dxa" w:w="879"/>
+            <w:tcW w:type="dxa" w:w="1417"/>
           </w:tcPr>
           <w:p>
             <w:r>
               <w:rPr>
                 <w:b/>
+                <w:sz w:val="18"/>
               </w:rPr>
               <w:t>Zona</w:t>
             </w:r>
@@ -293,25 +326,27 @@
         </w:tc>
         <w:tc>
           <w:tcPr>
-            <w:tcW w:type="dxa" w:w="879"/>
+            <w:tcW w:type="dxa" w:w="1247"/>
           </w:tcPr>
           <w:p>
             <w:r>
               <w:rPr>
                 <w:b/>
+                <w:sz w:val="18"/>
               </w:rPr>
-              <w:t>Área</w:t>
+              <w:t>Área (m²)</w:t>
             </w:r>
           </w:p>
         </w:tc>
         <w:tc>
           <w:tcPr>
-            <w:tcW w:type="dxa" w:w="879"/>
+            <w:tcW w:type="dxa" w:w="850"/>
           </w:tcPr>
           <w:p>
             <w:r>
               <w:rPr>
                 <w:b/>
+                <w:sz w:val="18"/>
               </w:rPr>
               <w:t>%</w:t>
             </w:r>
@@ -319,64 +354,69 @@
         </w:tc>
         <w:tc>
           <w:tcPr>
-            <w:tcW w:type="dxa" w:w="879"/>
+            <w:tcW w:type="dxa" w:w="850"/>
           </w:tcPr>
           <w:p>
             <w:r>
               <w:rPr>
                 <w:b/>
+                <w:sz w:val="18"/>
               </w:rPr>
-              <w:t>C.A max</w:t>
+              <w:t>CA máx</w:t>
             </w:r>
           </w:p>
         </w:tc>
         <w:tc>
           <w:tcPr>
-            <w:tcW w:type="dxa" w:w="879"/>
+            <w:tcW w:type="dxa" w:w="850"/>
           </w:tcPr>
           <w:p>
             <w:r>
               <w:rPr>
                 <w:b/>
+                <w:sz w:val="18"/>
               </w:rPr>
-              <w:t>C.A bas</w:t>
+              <w:t>CA bas</w:t>
             </w:r>
           </w:p>
         </w:tc>
         <w:tc>
           <w:tcPr>
-            <w:tcW w:type="dxa" w:w="879"/>
+            <w:tcW w:type="dxa" w:w="850"/>
           </w:tcPr>
           <w:p>
             <w:r>
               <w:rPr>
                 <w:b/>
+                <w:sz w:val="18"/>
               </w:rPr>
-              <w:t>TPS (Perm)</w:t>
+              <w:t>TPS</w:t>
             </w:r>
           </w:p>
         </w:tc>
         <w:tc>
           <w:tcPr>
-            <w:tcW w:type="dxa" w:w="879"/>
+            <w:tcW w:type="dxa" w:w="850"/>
           </w:tcPr>
           <w:p>
             <w:r>
               <w:rPr>
                 <w:b/>
+                <w:sz w:val="18"/>
               </w:rPr>
-              <w:t>TOS (Ocup)</w:t>
+              <w:t>TOS</w:t>
             </w:r>
           </w:p>
         </w:tc>
         <w:tc>
           <w:tcPr>
-            <w:tcW w:type="dxa" w:w="879"/>
+            <w:tcW w:type="dxa" w:w="850"/>
           </w:tcPr>
           <w:p>
             <w:r>
               <w:rPr>
                 <w:b/>
+                <w:sz w:val="18"/>
               </w:rPr>
               <w:t>Pav Bas</w:t>
             </w:r>
@@ -384,25 +424,27 @@
         </w:tc>
         <w:tc>
           <w:tcPr>
-            <w:tcW w:type="dxa" w:w="879"/>
+            <w:tcW w:type="dxa" w:w="850"/>
           </w:tcPr>
           <w:p>
             <w:r>
               <w:rPr>
                 <w:b/>
+                <w:sz w:val="18"/>
               </w:rPr>
-              <w:t>Pav Max</w:t>
+              <w:t>Pav Máx</w:t>
             </w:r>
           </w:p>
         </w:tc>
         <w:tc>
           <w:tcPr>
-            <w:tcW w:type="dxa" w:w="879"/>
+            <w:tcW w:type="dxa" w:w="1134"/>
           </w:tcPr>
           <w:p>
             <w:r>
               <w:rPr>
                 <w:b/>
+                <w:sz w:val="18"/>
               </w:rPr>
               <w:t>Recuo Fr</w:t>
             </w:r>
@@ -412,101 +454,131 @@
       <w:tr>
         <w:tc>
           <w:tcPr>
-            <w:tcW w:type="dxa" w:w="879"/>
+            <w:tcW w:type="dxa" w:w="1417"/>
           </w:tcPr>
           <w:p>
             <w:r>
-              <w:t>{% for row in TABELA_ZONAS_LIST %}{{row.codigo}}</w:t>
+              <w:rPr>
+                <w:sz w:val="18"/>
+              </w:rPr>
+              <w:t>{%tr for row in TABELA_ZONAS_LIST %}{{row.codigo}}</w:t>
             </w:r>
           </w:p>
         </w:tc>
         <w:tc>
           <w:tcPr>
-            <w:tcW w:type="dxa" w:w="879"/>
+            <w:tcW w:type="dxa" w:w="1247"/>
           </w:tcPr>
           <w:p>
             <w:r>
+              <w:rPr>
+                <w:sz w:val="18"/>
+              </w:rPr>
               <w:t>{{row.area}}</w:t>
             </w:r>
           </w:p>
         </w:tc>
         <w:tc>
           <w:tcPr>
-            <w:tcW w:type="dxa" w:w="879"/>
+            <w:tcW w:type="dxa" w:w="850"/>
           </w:tcPr>
           <w:p>
             <w:r>
+              <w:rPr>
+                <w:sz w:val="18"/>
+              </w:rPr>
               <w:t>{{row.perc}}</w:t>
             </w:r>
           </w:p>
         </w:tc>
         <w:tc>
           <w:tcPr>
-            <w:tcW w:type="dxa" w:w="879"/>
+            <w:tcW w:type="dxa" w:w="850"/>
           </w:tcPr>
           <w:p>
             <w:r>
+              <w:rPr>
+                <w:sz w:val="18"/>
+              </w:rPr>
               <w:t>{{row.ca_max}}</w:t>
             </w:r>
           </w:p>
         </w:tc>
         <w:tc>
           <w:tcPr>
-            <w:tcW w:type="dxa" w:w="879"/>
+            <w:tcW w:type="dxa" w:w="850"/>
           </w:tcPr>
           <w:p>
             <w:r>
+              <w:rPr>
+                <w:sz w:val="18"/>
+              </w:rPr>
               <w:t>{{row.ca_bas}}</w:t>
             </w:r>
           </w:p>
         </w:tc>
         <w:tc>
           <w:tcPr>
-            <w:tcW w:type="dxa" w:w="879"/>
+            <w:tcW w:type="dxa" w:w="850"/>
           </w:tcPr>
           <w:p>
             <w:r>
+              <w:rPr>
+                <w:sz w:val="18"/>
+              </w:rPr>
               <w:t>{{row.tps}}</w:t>
             </w:r>
           </w:p>
         </w:tc>
         <w:tc>
           <w:tcPr>
-            <w:tcW w:type="dxa" w:w="879"/>
+            <w:tcW w:type="dxa" w:w="850"/>
           </w:tcPr>
           <w:p>
             <w:r>
+              <w:rPr>
+                <w:sz w:val="18"/>
+              </w:rPr>
               <w:t>{{row.tos}}</w:t>
             </w:r>
           </w:p>
         </w:tc>
         <w:tc>
           <w:tcPr>
-            <w:tcW w:type="dxa" w:w="879"/>
+            <w:tcW w:type="dxa" w:w="850"/>
           </w:tcPr>
           <w:p>
             <w:r>
+              <w:rPr>
+                <w:sz w:val="18"/>
+              </w:rPr>
               <w:t>{{row.np_bas}}</w:t>
             </w:r>
           </w:p>
         </w:tc>
         <w:tc>
           <w:tcPr>
-            <w:tcW w:type="dxa" w:w="879"/>
+            <w:tcW w:type="dxa" w:w="850"/>
           </w:tcPr>
           <w:p>
             <w:r>
+              <w:rPr>
+                <w:sz w:val="18"/>
+              </w:rPr>
               <w:t>{{row.np_max}}</w:t>
             </w:r>
           </w:p>
         </w:tc>
         <w:tc>
           <w:tcPr>
-            <w:tcW w:type="dxa" w:w="879"/>
+            <w:tcW w:type="dxa" w:w="1134"/>
           </w:tcPr>
           <w:p>
             <w:r>
-              <w:t>{{row.rf}}{% endfor %}</w:t>
+              <w:rPr>
+                <w:sz w:val="18"/>
+              </w:rPr>
+              <w:t>{{row.rf}}{%tr endfor %}</w:t>
             </w:r>
           </w:p>
         </w:tc>
@@ -523,12 +595,12 @@
     </w:p>
     <w:p>
       <w:r>
-        <w:t>Faixa NUIC: {{ APP_FAIXA_STATUS }} ({{ APP_FAIXA_LARGURA }} m) - {{ APP_FAIXA_OBS }}</w:t>
+        <w:t>Faixa NUIC: {{ APP_FAIXA_STATUS }} ({{ APP_FAIXA_LARGURA }} m) — {{ APP_FAIXA_OBS }}</w:t>
       </w:r>
     </w:p>
     <w:p>
       <w:r>
-        <w:t>Manguezal: {{ APP_MANGUE_STATUS }} - {{ APP_MANGUE_OBS }}</w:t>
+        <w:t>Manguezal: {{ APP_MANGUE_STATUS }} — {{ APP_MANGUE_OBS }}</w:t>
       </w:r>
     </w:p>
     <w:p/>
@@ -543,6 +615,7 @@
     <w:tbl>
       <w:tblPr>
         <w:tblW w:type="auto" w:w="0"/>
+        <w:tblLayout w:type="fixed"/>
         <w:tblLook w:firstColumn="1" w:firstRow="1" w:lastColumn="0" w:lastRow="0" w:noHBand="0" w:noVBand="1" w:val="04A0"/>
       </w:tblPr>
       <w:tblGrid>
@@ -554,13 +627,14 @@
       <w:tr>
         <w:tc>
           <w:tcPr>
-            <w:tcW w:type="dxa" w:w="4394"/>
+            <w:tcW w:type="dxa" w:w="3969"/>
             <w:gridSpan w:val="2"/>
           </w:tcPr>
           <w:p>
             <w:r>
               <w:rPr>
                 <w:b/>
+                <w:sz w:val="20"/>
               </w:rPr>
               <w:t>Suscetibilidade a Inundação</w:t>
             </w:r>
@@ -568,13 +642,14 @@
         </w:tc>
         <w:tc>
           <w:tcPr>
-            <w:tcW w:type="dxa" w:w="4394"/>
+            <w:tcW w:type="dxa" w:w="3969"/>
             <w:gridSpan w:val="2"/>
           </w:tcPr>
           <w:p>
             <w:r>
               <w:rPr>
                 <w:b/>
+                <w:sz w:val="20"/>
               </w:rPr>
               <w:t>Suscetibilidade a Movimentos de Massa</w:t>
             </w:r>
@@ -584,17 +659,17 @@
       <w:tr>
         <w:tc>
           <w:tcPr>
-            <w:tcW w:type="dxa" w:w="2197"/>
+            <w:tcW w:type="dxa" w:w="567"/>
           </w:tcPr>
           <w:p>
             <w:r>
-              <w:t xml:space="preserve">{% cellbg RISCO_INUND_COR %} </w:t>
+              <w:t xml:space="preserve">{%cellbg RISCO_INUND_COR%}  </w:t>
             </w:r>
           </w:p>
         </w:tc>
         <w:tc>
           <w:tcPr>
-            <w:tcW w:type="dxa" w:w="2197"/>
+            <w:tcW w:type="dxa" w:w="3969"/>
           </w:tcPr>
           <w:p>
             <w:r>
@@ -604,17 +679,17 @@
         </w:tc>
         <w:tc>
           <w:tcPr>
-            <w:tcW w:type="dxa" w:w="2197"/>
+            <w:tcW w:type="dxa" w:w="567"/>
           </w:tcPr>
           <w:p>
             <w:r>
-              <w:t xml:space="preserve">{% cellbg RISCO_MOV_COR %} </w:t>
+              <w:t xml:space="preserve">{%cellbg RISCO_MOV_COR%}  </w:t>
             </w:r>
           </w:p>
         </w:tc>
         <w:tc>
           <w:tcPr>
-            <w:tcW w:type="dxa" w:w="2197"/>
+            <w:tcW w:type="dxa" w:w="3969"/>
           </w:tcPr>
           <w:p>
             <w:r>
@@ -626,7 +701,7 @@
       <w:tr>
         <w:tc>
           <w:tcPr>
-            <w:tcW w:type="dxa" w:w="4394"/>
+            <w:tcW w:type="dxa" w:w="3969"/>
             <w:gridSpan w:val="2"/>
           </w:tcPr>
           <w:p>
@@ -637,7 +712,7 @@
         </w:tc>
         <w:tc>
           <w:tcPr>
-            <w:tcW w:type="dxa" w:w="4394"/>
+            <w:tcW w:type="dxa" w:w="3969"/>
             <w:gridSpan w:val="2"/>
           </w:tcPr>
           <w:p>
@@ -660,6 +735,7 @@
     <w:tbl>
       <w:tblPr>
         <w:tblW w:type="auto" w:w="0"/>
+        <w:tblLayout w:type="fixed"/>
         <w:tblLook w:firstColumn="1" w:firstRow="1" w:lastColumn="0" w:lastRow="0" w:noHBand="0" w:noVBand="1" w:val="04A0"/>
       </w:tblPr>
       <w:tblGrid>
@@ -672,12 +748,13 @@
       <w:tr>
         <w:tc>
           <w:tcPr>
-            <w:tcW w:type="dxa" w:w="1757"/>
+            <w:tcW w:type="dxa" w:w="2268"/>
           </w:tcPr>
           <w:p>
             <w:r>
               <w:rPr>
                 <w:b/>
+                <w:sz w:val="18"/>
               </w:rPr>
               <w:t>Faixa de Inclinação</w:t>
             </w:r>
@@ -685,25 +762,27 @@
         </w:tc>
         <w:tc>
           <w:tcPr>
-            <w:tcW w:type="dxa" w:w="1757"/>
+            <w:tcW w:type="dxa" w:w="680"/>
           </w:tcPr>
           <w:p>
             <w:r>
               <w:rPr>
                 <w:b/>
+                <w:sz w:val="18"/>
               </w:rPr>
-              <w:t>Legenda</w:t>
+              <w:t>Cor</w:t>
             </w:r>
           </w:p>
         </w:tc>
         <w:tc>
           <w:tcPr>
-            <w:tcW w:type="dxa" w:w="1757"/>
+            <w:tcW w:type="dxa" w:w="1701"/>
           </w:tcPr>
           <w:p>
             <w:r>
               <w:rPr>
                 <w:b/>
+                <w:sz w:val="18"/>
               </w:rPr>
               <w:t>Área (m²)</w:t>
             </w:r>
@@ -711,12 +790,13 @@
         </w:tc>
         <w:tc>
           <w:tcPr>
-            <w:tcW w:type="dxa" w:w="1757"/>
+            <w:tcW w:type="dxa" w:w="1417"/>
           </w:tcPr>
           <w:p>
             <w:r>
               <w:rPr>
                 <w:b/>
+                <w:sz w:val="18"/>
               </w:rPr>
               <w:t>% da Área</w:t>
             </w:r>
@@ -724,12 +804,13 @@
         </w:tc>
         <w:tc>
           <w:tcPr>
-            <w:tcW w:type="dxa" w:w="1757"/>
+            <w:tcW w:type="dxa" w:w="1417"/>
           </w:tcPr>
           <w:p>
             <w:r>
               <w:rPr>
                 <w:b/>
+                <w:sz w:val="18"/>
               </w:rPr>
               <w:t>Notas</w:t>
             </w:r>
@@ -739,51 +820,66 @@
       <w:tr>
         <w:tc>
           <w:tcPr>
-            <w:tcW w:type="dxa" w:w="1757"/>
+            <w:tcW w:type="dxa" w:w="2268"/>
           </w:tcPr>
           <w:p>
             <w:r>
-              <w:t>{% for row in TABELA_INCLINACAO_LIST %}{{row.faixa}}</w:t>
+              <w:rPr>
+                <w:sz w:val="18"/>
+              </w:rPr>
+              <w:t>{%tr for row in TABELA_INCLINACAO_LIST %}{{row.faixa}}</w:t>
             </w:r>
           </w:p>
         </w:tc>
         <w:tc>
           <w:tcPr>
-            <w:tcW w:type="dxa" w:w="1757"/>
+            <w:tcW w:type="dxa" w:w="680"/>
           </w:tcPr>
           <w:p>
             <w:r>
-              <w:t xml:space="preserve">{% cellbg row.cor %} </w:t>
+              <w:rPr>
+                <w:sz w:val="18"/>
+              </w:rPr>
+              <w:t xml:space="preserve">{%cellbg row.cor%}  </w:t>
             </w:r>
           </w:p>
         </w:tc>
         <w:tc>
           <w:tcPr>
-            <w:tcW w:type="dxa" w:w="1757"/>
+            <w:tcW w:type="dxa" w:w="1701"/>
           </w:tcPr>
           <w:p>
             <w:r>
+              <w:rPr>
+                <w:sz w:val="18"/>
+              </w:rPr>
               <w:t>{{row.area}}</w:t>
             </w:r>
           </w:p>
         </w:tc>
         <w:tc>
           <w:tcPr>
-            <w:tcW w:type="dxa" w:w="1757"/>
+            <w:tcW w:type="dxa" w:w="1417"/>
           </w:tcPr>
           <w:p>
             <w:r>
+              <w:rPr>
+                <w:sz w:val="18"/>
+              </w:rPr>
               <w:t>{{row.perc}}</w:t>
             </w:r>
           </w:p>
         </w:tc>
         <w:tc>
           <w:tcPr>
-            <w:tcW w:type="dxa" w:w="1757"/>
+            <w:tcW w:type="dxa" w:w="1417"/>
           </w:tcPr>
           <w:p>
             <w:r>
-              <w:t>{{row.notas}}{% endfor %}</w:t>
+              <w:rPr>
+                <w:sz w:val="18"/>
+              </w:rPr>
+              <w:t>{{row.notas}}{%tr endfor %}</w:t>
             </w:r>
           </w:p>
         </w:tc>
@@ -796,6 +892,14 @@
       </w:pPr>
       <w:r>
         <w:t>7. NOTAS E CONDICIONANTES TÉCNICAS</w:t>
+      </w:r>
+    </w:p>
+    <w:p>
+      <w:r>
+        <w:rPr>
+          <w:b/>
+        </w:rPr>
+        <w:t>Notas técnicas e legislativas:</w:t>
       </w:r>
     </w:p>
     <w:p>
@@ -805,7 +909,23 @@
     </w:p>
     <w:p>
       <w:r>
+        <w:rPr>
+          <w:b/>
+        </w:rPr>
+        <w:t>Condicionantes para a análise:</w:t>
+      </w:r>
+    </w:p>
+    <w:p>
+      <w:r>
         <w:t>{{ LISTA_CONDICIONANTES_BULLETS }}</w:t>
+      </w:r>
+    </w:p>
+    <w:p>
+      <w:r>
+        <w:rPr>
+          <w:b/>
+        </w:rPr>
+        <w:t>Restrições e pendências:</w:t>
       </w:r>
     </w:p>
     <w:p>
@@ -819,7 +939,7 @@
         <w:pStyle w:val="ZoniHeading"/>
       </w:pPr>
       <w:r>
-        <w:t>8. MAPA DE SITUAÇÃO / ANEXOS GRAFICOS</w:t>
+        <w:t>8. MAPA DE SITUAÇÃO / ANEXOS GRÁFICOS</w:t>
       </w:r>
     </w:p>
     <w:p>

</xml_diff>